<commit_message>
Update CV to latest AI-engineer version
</commit_message>
<xml_diff>
--- a/assets/cv/David_Hill_CV.docx
+++ b/assets/cv/David_Hill_CV.docx
@@ -128,22 +128,37 @@
                 <w:sz w:val="16"/>
                 <w:szCs w:val="16"/>
               </w:rPr>
+              <w:t>Portfolio: portfolio.necroknollnexus.dpdns.org</w:t>
+            </w:r>
+          </w:p>
+          <w:p>
+            <w:pPr>
+              <w:spacing w:after="40"/>
+            </w:pPr>
+            <w:r>
+              <w:rPr>
+                <w:b w:val="false"/>
+                <w:bCs w:val="false"/>
+                <w:color w:val="444444"/>
+                <w:sz w:val="16"/>
+                <w:szCs w:val="16"/>
+              </w:rPr>
+              <w:t>GitHub: github.com/SassBlanket98</w:t>
+            </w:r>
+          </w:p>
+          <w:p>
+            <w:pPr>
+              <w:spacing w:after="40"/>
+            </w:pPr>
+            <w:r>
+              <w:rPr>
+                <w:b w:val="false"/>
+                <w:bCs w:val="false"/>
+                <w:color w:val="444444"/>
+                <w:sz w:val="16"/>
+                <w:szCs w:val="16"/>
+              </w:rPr>
               <w:t xml:space="preserve">Johannesburg</w:t>
-            </w:r>
-          </w:p>
-          <w:p>
-            <w:pPr>
-              <w:spacing w:after="40"/>
-            </w:pPr>
-            <w:r>
-              <w:rPr>
-                <w:b w:val="false"/>
-                <w:bCs w:val="false"/>
-                <w:color w:val="444444"/>
-                <w:sz w:val="16"/>
-                <w:szCs w:val="16"/>
-              </w:rPr>
-              <w:t xml:space="preserve">Relocating to Cape Town</w:t>
             </w:r>
           </w:p>
           <w:p>
@@ -392,111 +407,6 @@
                 <w:szCs w:val="16"/>
               </w:rPr>
               <w:t xml:space="preserve">HTML, CSS &amp; API Integration</w:t>
-            </w:r>
-          </w:p>
-          <w:p>
-            <w:pPr>
-              <w:spacing w:after="40"/>
-            </w:pPr>
-            <w:r>
-              <w:rPr>
-                <w:b w:val="false"/>
-                <w:bCs w:val="false"/>
-                <w:color w:val="444444"/>
-                <w:sz w:val="16"/>
-                <w:szCs w:val="16"/>
-              </w:rPr>
-              <w:t xml:space="preserve">Microsoft 365 &amp; Entra ID</w:t>
-            </w:r>
-          </w:p>
-          <w:p>
-            <w:pPr>
-              <w:spacing w:after="40"/>
-            </w:pPr>
-            <w:r>
-              <w:rPr>
-                <w:b w:val="false"/>
-                <w:bCs w:val="false"/>
-                <w:color w:val="444444"/>
-                <w:sz w:val="16"/>
-                <w:szCs w:val="16"/>
-              </w:rPr>
-              <w:t xml:space="preserve">Active Directory (Users, GPO, OUs)</w:t>
-            </w:r>
-          </w:p>
-          <w:p>
-            <w:pPr>
-              <w:spacing w:after="40"/>
-            </w:pPr>
-            <w:r>
-              <w:rPr>
-                <w:b w:val="false"/>
-                <w:bCs w:val="false"/>
-                <w:color w:val="444444"/>
-                <w:sz w:val="16"/>
-                <w:szCs w:val="16"/>
-              </w:rPr>
-              <w:t xml:space="preserve">Proxmox VE &amp; Cluster Management</w:t>
-            </w:r>
-          </w:p>
-          <w:p>
-            <w:pPr>
-              <w:spacing w:after="40"/>
-            </w:pPr>
-            <w:r>
-              <w:rPr>
-                <w:b w:val="false"/>
-                <w:bCs w:val="false"/>
-                <w:color w:val="444444"/>
-                <w:sz w:val="16"/>
-                <w:szCs w:val="16"/>
-              </w:rPr>
-              <w:t xml:space="preserve">Windows Server &amp; Domain Admin</w:t>
-            </w:r>
-          </w:p>
-          <w:p>
-            <w:pPr>
-              <w:spacing w:after="40"/>
-            </w:pPr>
-            <w:r>
-              <w:rPr>
-                <w:b w:val="false"/>
-                <w:bCs w:val="false"/>
-                <w:color w:val="444444"/>
-                <w:sz w:val="16"/>
-                <w:szCs w:val="16"/>
-              </w:rPr>
-              <w:t xml:space="preserve">Managed Switches, VLANs &amp; Networking</w:t>
-            </w:r>
-          </w:p>
-          <w:p>
-            <w:pPr>
-              <w:spacing w:after="40"/>
-            </w:pPr>
-            <w:r>
-              <w:rPr>
-                <w:b w:val="false"/>
-                <w:bCs w:val="false"/>
-                <w:color w:val="444444"/>
-                <w:sz w:val="16"/>
-                <w:szCs w:val="16"/>
-              </w:rPr>
-              <w:t xml:space="preserve">Firewall &amp; Network Security</w:t>
-            </w:r>
-          </w:p>
-          <w:p>
-            <w:pPr>
-              <w:spacing w:after="40"/>
-            </w:pPr>
-            <w:r>
-              <w:rPr>
-                <w:b w:val="false"/>
-                <w:bCs w:val="false"/>
-                <w:color w:val="444444"/>
-                <w:sz w:val="16"/>
-                <w:szCs w:val="16"/>
-              </w:rPr>
-              <w:t xml:space="preserve">Desktop, Laptop &amp; Server Hardware</w:t>
             </w:r>
           </w:p>
           <w:p>
@@ -933,7 +843,7 @@
                 <w:sz w:val="17"/>
                 <w:szCs w:val="17"/>
               </w:rPr>
-              <w:t xml:space="preserve">Provide IT support and infrastructure administration across Neozeit's SME client portfolio: second-line Microsoft 365 support (Exchange Online, SharePoint, Teams, Entra ID provisioning and licensing), vulnerability remediation scripting (Python, PowerShell) for ongoing CVE patching, and on-premises Active Directory domain deployment (OU structure, GPO, user management).</w:t>
+              <w:t>Infrastructure and support administration across Neozeit's SME client portfolio, including Microsoft 365, Active Directory, and Proxmox VE cluster management.</w:t>
             </w:r>
           </w:p>
           <w:p>
@@ -1585,7 +1495,7 @@
                 <w:sz w:val="17"/>
                 <w:szCs w:val="17"/>
               </w:rPr>
-              <w:t xml:space="preserve">Active GitHub repository spanning personal and professional projects across the full development lifecycle.</w:t>
+              <w:t>Active GitHub portfolio at github.com/SassBlanket98 with live project repositories.</w:t>
             </w:r>
           </w:p>
         </w:tc>

</xml_diff>

<commit_message>
CV humanized — AI patterns removed, PDF regenerated
</commit_message>
<xml_diff>
--- a/assets/cv/David_Hill_CV.docx
+++ b/assets/cv/David_Hill_CV.docx
@@ -678,7 +678,7 @@
                 <w:sz w:val="17"/>
                 <w:szCs w:val="17"/>
               </w:rPr>
-              <w:t>AI-focused developer with hands-on experience building multi-agent AI systems, LLM-based applications and retrieval-backed memory architectures. Designs system architecture and agent behaviour, then delivers through AI-assisted development — owning the design decisions, code review, debugging and production validation. Self-hosts a personal multi-agent AI stack in daily production use, and led the deployment of a production multi-agent system for a client workforce, including the implementation and integration of MemPalace, an open-source ChromaDB-based memory system exposing 29 tool functions via its MCP server for persistent context across agents. Coding with AI tools since 2022, from early manual prompt-loop workflows through to modern agentic development. Seeking a role where AI development, LLM engineering and automation intersect.</w:t>
+              <w:t>AI-focused developer with hands-on experience building multi-agent AI systems, LLM-based applications and retrieval-backed memory architectures. Designs system architecture and agent behaviour, then delivers through AI-assisted development — owning the design decisions, code review, debugging and production validation. Self-hosts a personal multi-agent AI stack in daily production use, and led the deployment of a production multi-agent system for a client workforce, including integration of MemPalace, a ChromaDB-based memory system for persistent context across agents. Coding with AI tools since 2022, from early manual prompt-loop workflows through to modern agentic development. Seeking a role where AI development, LLM engineering and automation intersect.</w:t>
             </w:r>
           </w:p>
           <w:p>
@@ -753,7 +753,7 @@
                 <w:sz w:val="17"/>
                 <w:szCs w:val="17"/>
               </w:rPr>
-              <w:t>Led the design and deployment of a multi-agent AI automation system (OpenClaw) for Kernel &amp; Flint, including implementing and integrating MemPalace — an open-source ChromaDB-based memory system exposing 29 tool functions via its MCP server — for persistent context across agents.</w:t>
+              <w:t>Led the design and deployment of a multi-agent AI automation system (OpenClaw) for Kernel &amp; Flint, including integration of MemPalace, a ChromaDB-based memory system for persistent agent context.</w:t>
             </w:r>
           </w:p>
           <w:p>
@@ -825,7 +825,7 @@
                 <w:sz w:val="17"/>
                 <w:szCs w:val="17"/>
               </w:rPr>
-              <w:t xml:space="preserve">Built a Microsoft 365 recon and visibility dashboard using Extractor Suite and Analyzer Suite outputs, providing deep insight into SharePoint environments and tenant-wide security statistics.</w:t>
+              <w:t>Built a Microsoft 365 recon and visibility dashboard using Extractor Suite and Analyzer Suite outputs for SharePoint environments and tenant-wide security statistics.</w:t>
             </w:r>
           </w:p>
           <w:p>
@@ -1193,7 +1193,7 @@
                 <w:sz w:val="17"/>
                 <w:szCs w:val="17"/>
               </w:rPr>
-              <w:t xml:space="preserve">Private Family (2018) — daily transport and homework support for a school-age child. Battlezone Paintball (2017–18) — safety briefings, game flow and equipment maintenance. Riverside Liquors (2016–17) — PoS operation, sales and stock queries.</w:t>
+              <w:t>Private Family (2018): daily transport and homework support for a school-age child. Battlezone Paintball (2017-18): safety briefings, game flow and equipment maintenance. Riverside Liquors (2016-17): PoS operation, sales and stock queries.</w:t>
             </w:r>
           </w:p>
           <w:p>
@@ -1241,7 +1241,7 @@
                 <w:sz w:val="17"/>
                 <w:szCs w:val="17"/>
               </w:rPr>
-              <w:t xml:space="preserve">Architected and self-host a production multi-agent system on OpenClaw for daily personal and family use: three isolated agents (a primary personal assistant, a sports-science coaching agent used live by a professional cycling coach, and a family-support agent) plus a local model runner (Gemma4 via Ollama) for free on-device inference. Each agent runs its own isolated MemPalace — an open-source ChromaDB-based memory system exposing 29 tool functions via its MCP server — for persistent, agent-scoped memory with zero cross-contamination. Self-hosted end-to-end with zero external dependencies for core execution.</w:t>
+              <w:t>Architected and self-host a production multi-agent system on OpenClaw for daily personal and family use: three isolated agents (a primary personal assistant, a sports-science coaching agent used live by a professional cycling coach, and a family-support agent) plus a local model runner (Gemma4 via Ollama) for free on-device inference. Each agent runs its own isolated MemPalace — an open-source ChromaDB-based memory system exposing 29 tool functions via its MCP server — for persistent, agent-scoped memory with zero cross-contamination. Self-hosted with no external dependencies for core execution.</w:t>
             </w:r>
           </w:p>
           <w:p>
@@ -1270,7 +1270,7 @@
                 <w:sz w:val="17"/>
                 <w:szCs w:val="17"/>
               </w:rPr>
-              <w:t xml:space="preserve">Designed and deployed a production multi-agent system on OpenClaw for a client workforce spanning two tenant companies — an orchestrator, a live production executive-assistant agent, and two department agents (marketing and social media) designed and scoped for rollout. Implemented and integrated MemPalace, an open-source ChromaDB-based memory system exposing 29 tool functions via its MCP server, with physically separate palace instances and wing-scoped isolation per tenant. Tenant and department boundaries are enforced by filesystem and tool-schema configuration, not just documented policy, backed by a gated knowledge-graph write protocol and automated diary, compression and promotion pipelines. Migrated the agent fleet off the Anthropic API to Kimi K3 mid-2026, cutting inference costs while enhancing reliability, keeping the architecture provider-agnostic by design. Ongoing development and maintenance.</w:t>
+              <w:t>Designed and deployed a production multi-agent system on OpenClaw for a client workforce across two tenant companies: an orchestrator, a live production executive-assistant agent, and two department agents (marketing and social media) designed and scoped for rollout. Integrated MemPalace, a ChromaDB-based memory system with physically separate palace instances and wing-scoped isolation per tenant. Tenant and department boundaries are enforced by filesystem and tool-schema configuration, not just documented policy, backed by a gated knowledge-graph write protocol and automated diary, compression and promotion pipelines. Migrated the agent fleet off the Anthropic API to Kimi K3 mid-2026, cutting inference costs while enhancing reliability, keeping the architecture provider-agnostic by design. Ongoing development and maintenance.</w:t>
             </w:r>
           </w:p>
           <w:p>
@@ -1357,7 +1357,7 @@
                 <w:sz w:val="17"/>
                 <w:szCs w:val="17"/>
               </w:rPr>
-              <w:t xml:space="preserve">Production mapping platform for a medical client, enabling directors and marketing teams to visualise which doctors work with the organisation and where they are located. Node.js, Express, Sequelize, MariaDB, Leaflet, with React web, React Native Android and a PWA build. Ships a read-only MCP server exposing codebase query tools.</w:t>
+              <w:t>Production mapping platform for a medical client. Directors and marketing teams use it to visualise which doctors work with the organisation and where they are located. Node.js, Express, Sequelize, MariaDB, Leaflet, with React web, React Native Android and a PWA build. Ships a read-only MCP server exposing codebase query tools.</w:t>
             </w:r>
           </w:p>
           <w:p>

</xml_diff>

<commit_message>
Fix AI-stack claims, update CV, correct tool counts
Corrects tool counts and infra-ownership wording in the About section,
adds a decision-line on real tool scoping to the Multi-Tenant card, and
rebuilds the CV: ClickUp MCP server credit, corrected dates/counts, the
NHC inspection pipeline generalized to a medical client (no client
naming), and a macOS fleet patch-automation bullet. Site copy stays
anonymized to match the existing repo-slug convention.

Co-Authored-By: Claude Sonnet 5 <noreply@anthropic.com>
</commit_message>
<xml_diff>
--- a/assets/cv/David_Hill_CV.docx
+++ b/assets/cv/David_Hill_CV.docx
@@ -425,67 +425,22 @@
                 <w:sz w:val="17"/>
                 <w:szCs w:val="17"/>
               </w:rPr>
-              <w:t xml:space="preserve">CERTIFICATIONS</w:t>
-            </w:r>
-          </w:p>
-          <w:p>
-            <w:pPr>
-              <w:spacing w:after="20"/>
-            </w:pPr>
-            <w:r>
-              <w:rPr>
-                <w:b/>
-                <w:bCs/>
-                <w:color w:val="1F3552"/>
-                <w:sz w:val="16"/>
-                <w:szCs w:val="16"/>
-              </w:rPr>
-              <w:t xml:space="preserve">Kaspersky Sales Specialist</w:t>
-            </w:r>
-          </w:p>
-          <w:p>
-            <w:pPr>
-              <w:spacing w:after="100"/>
-            </w:pPr>
-            <w:r>
-              <w:rPr>
-                <w:b w:val="false"/>
-                <w:bCs w:val="false"/>
-                <w:color w:val="444444"/>
-                <w:sz w:val="16"/>
-                <w:szCs w:val="16"/>
-              </w:rPr>
-              <w:t xml:space="preserve">S02.11.1 · S41.10 · S40.70 · S20.10 · S39.02 · S38.30</w:t>
-            </w:r>
-          </w:p>
-          <w:p>
-            <w:pPr>
-              <w:spacing w:after="20"/>
-            </w:pPr>
-            <w:r>
-              <w:rPr>
-                <w:b/>
-                <w:bCs/>
-                <w:color w:val="1F3552"/>
-                <w:sz w:val="16"/>
-                <w:szCs w:val="16"/>
-              </w:rPr>
-              <w:t xml:space="preserve">Barracuda Certified Sales Partner</w:t>
-            </w:r>
-          </w:p>
-          <w:p>
-            <w:pPr>
-              <w:spacing w:after="40"/>
-            </w:pPr>
-            <w:r>
-              <w:rPr>
-                <w:b w:val="false"/>
-                <w:bCs w:val="false"/>
-                <w:color w:val="444444"/>
-                <w:sz w:val="16"/>
-                <w:szCs w:val="16"/>
-              </w:rPr>
-              <w:t xml:space="preserve">Email Security · Web Security · Vulnerability Remediation · Message Archiver · Load Balancer ADC · DDoS Prevention</w:t>
+              <w:t xml:space="preserve">LANGUAGES</w:t>
+            </w:r>
+          </w:p>
+          <w:p>
+            <w:pPr>
+              <w:spacing w:after="40"/>
+            </w:pPr>
+            <w:r>
+              <w:rPr>
+                <w:b w:val="false"/>
+                <w:bCs w:val="false"/>
+                <w:color w:val="444444"/>
+                <w:sz w:val="16"/>
+                <w:szCs w:val="16"/>
+              </w:rPr>
+              <w:t xml:space="preserve">English — Native</w:t>
             </w:r>
           </w:p>
           <w:p>
@@ -504,22 +459,22 @@
                 <w:sz w:val="17"/>
                 <w:szCs w:val="17"/>
               </w:rPr>
-              <w:t xml:space="preserve">LANGUAGES</w:t>
-            </w:r>
-          </w:p>
-          <w:p>
-            <w:pPr>
-              <w:spacing w:after="40"/>
-            </w:pPr>
-            <w:r>
-              <w:rPr>
-                <w:b w:val="false"/>
-                <w:bCs w:val="false"/>
-                <w:color w:val="444444"/>
-                <w:sz w:val="16"/>
-                <w:szCs w:val="16"/>
-              </w:rPr>
-              <w:t xml:space="preserve">English — Native</w:t>
+              <w:t xml:space="preserve">CERTIFICATIONS</w:t>
+            </w:r>
+          </w:p>
+          <w:p>
+            <w:pPr>
+              <w:spacing w:after="40"/>
+            </w:pPr>
+            <w:r>
+              <w:rPr>
+                <w:b w:val="false"/>
+                <w:bCs w:val="false"/>
+                <w:color w:val="444444"/>
+                <w:sz w:val="16"/>
+                <w:szCs w:val="16"/>
+              </w:rPr>
+              <w:t xml:space="preserve">Kaspersky Sales Specialist · Barracuda Certified Sales Partner</w:t>
             </w:r>
           </w:p>
           <w:p>
@@ -553,82 +508,7 @@
                 <w:sz w:val="16"/>
                 <w:szCs w:val="16"/>
               </w:rPr>
-              <w:t xml:space="preserve">AI &amp; Automation Development</w:t>
-            </w:r>
-          </w:p>
-          <w:p>
-            <w:pPr>
-              <w:spacing w:after="40"/>
-            </w:pPr>
-            <w:r>
-              <w:rPr>
-                <w:b w:val="false"/>
-                <w:bCs w:val="false"/>
-                <w:color w:val="444444"/>
-                <w:sz w:val="16"/>
-                <w:szCs w:val="16"/>
-              </w:rPr>
-              <w:t xml:space="preserve">Computer Hardware &amp; Custom Builds</w:t>
-            </w:r>
-          </w:p>
-          <w:p>
-            <w:pPr>
-              <w:spacing w:after="40"/>
-            </w:pPr>
-            <w:r>
-              <w:rPr>
-                <w:b w:val="false"/>
-                <w:bCs w:val="false"/>
-                <w:color w:val="444444"/>
-                <w:sz w:val="16"/>
-                <w:szCs w:val="16"/>
-              </w:rPr>
-              <w:t xml:space="preserve">Skateboarding</w:t>
-            </w:r>
-          </w:p>
-          <w:p>
-            <w:pPr>
-              <w:spacing w:after="40"/>
-            </w:pPr>
-            <w:r>
-              <w:rPr>
-                <w:b w:val="false"/>
-                <w:bCs w:val="false"/>
-                <w:color w:val="444444"/>
-                <w:sz w:val="16"/>
-                <w:szCs w:val="16"/>
-              </w:rPr>
-              <w:t xml:space="preserve">Music</w:t>
-            </w:r>
-          </w:p>
-          <w:p>
-            <w:pPr>
-              <w:spacing w:after="40"/>
-            </w:pPr>
-            <w:r>
-              <w:rPr>
-                <w:b w:val="false"/>
-                <w:bCs w:val="false"/>
-                <w:color w:val="444444"/>
-                <w:sz w:val="16"/>
-                <w:szCs w:val="16"/>
-              </w:rPr>
-              <w:t xml:space="preserve">Gaming &amp; High-Performance Tech</w:t>
-            </w:r>
-          </w:p>
-          <w:p>
-            <w:pPr>
-              <w:spacing w:after="40"/>
-            </w:pPr>
-            <w:r>
-              <w:rPr>
-                <w:b w:val="false"/>
-                <w:bCs w:val="false"/>
-                <w:color w:val="444444"/>
-                <w:sz w:val="16"/>
-                <w:szCs w:val="16"/>
-              </w:rPr>
-              <w:t xml:space="preserve">Content Creation &amp; Video Editing</w:t>
+              <w:t xml:space="preserve">Skateboarding, PC hardware, gaming and video editing</w:t>
             </w:r>
           </w:p>
         </w:tc>
@@ -720,7 +600,7 @@
                 <w:sz w:val="15"/>
                 <w:szCs w:val="15"/>
               </w:rPr>
-              <w:t xml:space="preserve">   Dec 2023 – Present</w:t>
+              <w:t xml:space="preserve">   Nov 2023 – Present</w:t>
             </w:r>
           </w:p>
           <w:p>
@@ -753,7 +633,7 @@
                 <w:sz w:val="17"/>
                 <w:szCs w:val="17"/>
               </w:rPr>
-              <w:t>Led the design and deployment of a multi-agent AI automation system (OpenClaw) for Kernel &amp; Flint, including integration of MemPalace, a ChromaDB-based memory system for persistent agent context.</w:t>
+              <w:t>Led the design and deployment of a multi-agent AI automation system (OpenClaw) for a two-company client workforce, including integration of MemPalace, a ChromaDB-based memory system for persistent agent context.</w:t>
             </w:r>
           </w:p>
           <w:p>
@@ -789,25 +669,43 @@
                 <w:sz w:val="17"/>
                 <w:szCs w:val="17"/>
               </w:rPr>
-              <w:t xml:space="preserve">Built and deployed production web applications for clients, including a doctor location mapping tool (Node.js) and automated synthetic monitoring for uptime and performance tracking (Python/Playwright).</w:t>
-            </w:r>
-          </w:p>
-          <w:p>
-            <w:pPr>
-              <w:pStyle w:val="ListParagraph"/>
-              <w:numPr>
-                <w:ilvl w:val="0"/>
-                <w:numId w:val="2"/>
-              </w:numPr>
-              <w:spacing w:after="60" w:line="250"/>
-            </w:pPr>
-            <w:r>
-              <w:rPr>
-                <w:color w:val="444444"/>
-                <w:sz w:val="17"/>
-                <w:szCs w:val="17"/>
-              </w:rPr>
-              <w:t>Developed and maintain a financial market dashboard for Adviceworx with automated Telegram delivery of daily updates and Claude-powered market summarisation, built for Neozeit client work using a custom Telegram bot.</w:t>
+              <w:t>Built a custom ClickUp MCP server (TypeScript, 18 tools) for live task and project status, integrated into the flagship production agent.</w:t>
+            </w:r>
+          </w:p>
+          <w:p>
+            <w:pPr>
+              <w:pStyle w:val="ListParagraph"/>
+              <w:numPr>
+                <w:ilvl w:val="0"/>
+                <w:numId w:val="2"/>
+              </w:numPr>
+              <w:spacing w:after="60" w:line="250"/>
+            </w:pPr>
+            <w:r>
+              <w:rPr>
+                <w:color w:val="444444"/>
+                <w:sz w:val="17"/>
+                <w:szCs w:val="17"/>
+              </w:rPr>
+              <w:t xml:space="preserve">Built and deployed production web applications for clients, including a doctor location mapping tool (Node.js).</w:t>
+            </w:r>
+          </w:p>
+          <w:p>
+            <w:pPr>
+              <w:pStyle w:val="ListParagraph"/>
+              <w:numPr>
+                <w:ilvl w:val="0"/>
+                <w:numId w:val="2"/>
+              </w:numPr>
+              <w:spacing w:after="60" w:line="250"/>
+            </w:pPr>
+            <w:r>
+              <w:rPr>
+                <w:color w:val="444444"/>
+                <w:sz w:val="17"/>
+                <w:szCs w:val="17"/>
+              </w:rPr>
+              <w:t>Developed and maintain a financial market dashboard for a financial advisory practice with automated Telegram delivery of daily updates, built for Neozeit client work using a custom Telegram bot.</w:t>
             </w:r>
           </w:p>
           <w:p>
@@ -861,7 +759,25 @@
                 <w:sz w:val="17"/>
                 <w:szCs w:val="17"/>
               </w:rPr>
-              <w:t xml:space="preserve">Sole operator of Neozeit's Proxmox VE infrastructure (3-node cluster, 12-drive RAID6 backup server, LTO-4 tape rotation, managed Avaya switch); led the Windows Server 2025 migration for NHC (medical client).</w:t>
+              <w:t xml:space="preserve">Sole operator of Neozeit's Proxmox VE infrastructure (3-node cluster, 12-drive RAID6 backup server, LTO-4 tape rotation, managed Avaya switch); led the Windows Server 2025 migration for a medical client.</w:t>
+            </w:r>
+          </w:p>
+          <w:p>
+            <w:pPr>
+              <w:pStyle w:val="ListParagraph"/>
+              <w:numPr>
+                <w:ilvl w:val="0"/>
+                <w:numId w:val="2"/>
+              </w:numPr>
+              <w:spacing w:after="60" w:line="250"/>
+            </w:pPr>
+            <w:r>
+              <w:rPr>
+                <w:color w:val="444444"/>
+                <w:sz w:val="17"/>
+                <w:szCs w:val="17"/>
+              </w:rPr>
+              <w:t xml:space="preserve">Built shell-script automation for update and patch management across a client’s macOS fleet of roughly 160 devices.</w:t>
             </w:r>
           </w:p>
           <w:p>
@@ -1241,7 +1157,7 @@
                 <w:sz w:val="17"/>
                 <w:szCs w:val="17"/>
               </w:rPr>
-              <w:t>Architected and self-host a production multi-agent system on OpenClaw for daily personal and family use: three isolated agents (a primary personal assistant, a sports-science coaching agent used live by a professional cycling coach, and a family-support agent) plus a local model runner (Gemma4 via Ollama) for free on-device inference. Each agent runs its own isolated MemPalace — an open-source ChromaDB-based memory system exposing 29 tool functions via its MCP server — for persistent, agent-scoped memory with zero cross-contamination. Self-hosted with no external dependencies for core execution.</w:t>
+              <w:t>Architected and self-host a production multi-agent system on OpenClaw for daily personal and family use: three isolated agents (a primary personal assistant, a sports-science coaching agent used live by a professional cycling coach, and a family-support agent) plus a local model runner (gemma4:12b via Ollama) for free on-device inference. The sports-science and family-support agents run on Kimi K3 with a GLM-5.2 fallback via OpenRouter. Each agent runs its own isolated MemPalace — an open-source ChromaDB-based memory system exposing 30 tool functions via its MCP server — for persistent, agent-scoped memory with zero cross-contamination. Self-hosted with no external dependencies for core execution.</w:t>
             </w:r>
           </w:p>
           <w:p>
@@ -1256,7 +1172,7 @@
                 <w:sz w:val="17"/>
                 <w:szCs w:val="17"/>
               </w:rPr>
-              <w:t xml:space="preserve">Flint &amp; Kernel Multi-Tenant Agent Deployment</w:t>
+              <w:t xml:space="preserve">Multi-Tenant Agent Deployment</w:t>
             </w:r>
           </w:p>
           <w:p>
@@ -1270,7 +1186,7 @@
                 <w:sz w:val="17"/>
                 <w:szCs w:val="17"/>
               </w:rPr>
-              <w:t>Designed and deployed a production multi-agent system on OpenClaw for a client workforce across two tenant companies: an orchestrator, a live production executive-assistant agent, and two department agents (marketing and social media) designed and scoped for rollout. Integrated MemPalace, a ChromaDB-based memory system with physically separate palace instances and wing-scoped isolation per tenant. Tenant and department boundaries are enforced by filesystem and tool-schema configuration, not just documented policy, backed by a gated knowledge-graph write protocol and automated diary, compression and promotion pipelines. Migrated the agent fleet off the Anthropic API to Kimi K3 mid-2026, cutting inference costs while enhancing reliability, keeping the architecture provider-agnostic by design. Ongoing development and maintenance.</w:t>
+              <w:t>Designed and deployed a production multi-agent system on OpenClaw for a client workforce across two tenant companies: an orchestrator, a live production executive-assistant agent, and two department agents (marketing and social media) designed and scoped for rollout. Integrated MemPalace, a ChromaDB-based memory system with physically separate palace instances and wing-scoped isolation per tenant. Tenant and department boundaries are enforced by filesystem and tool-schema configuration, not just documented policy, backed by a gated knowledge-graph write protocol and automated diary, compression and promotion pipelines. Migrated the agent fleet off the Anthropic API to Kimi K3 in July 2026, cutting inference costs while enhancing reliability, keeping the architecture provider-agnostic by design. Ongoing development and maintenance.</w:t>
             </w:r>
           </w:p>
           <w:p>
@@ -1314,7 +1230,7 @@
                 <w:sz w:val="17"/>
                 <w:szCs w:val="17"/>
               </w:rPr>
-              <w:t xml:space="preserve">Charlie Dashboard — AI Cyber Intelligence &amp; GTM Platform (Kernel Afrika)</w:t>
+              <w:t xml:space="preserve">Vantage Point Dashboard — AI Cyber Intelligence &amp; GTM Platform (Cybersecurity Vendor)</w:t>
             </w:r>
           </w:p>
           <w:p>
@@ -1328,7 +1244,7 @@
                 <w:sz w:val="17"/>
                 <w:szCs w:val="17"/>
               </w:rPr>
-              <w:t xml:space="preserve">Full-stack platform combining RSS threat-intel aggregation, autonomous competitor research and persona-tailored content generation. Custom ReAct-style agent loop built directly against the Anthropic Messages API — no agent framework — with end-to-end SSE streaming of agent reasoning and tool calls to a live UI. Deliberately tiered: deterministic keyword heuristics on the high-volume path, model calls reserved for curated work. React, TypeScript, Fastify, Prisma, PostgreSQL. In active development.</w:t>
+              <w:t xml:space="preserve">Full-stack platform combining RSS threat-intel aggregation, autonomous competitor research and persona-tailored content generation. Custom ReAct-style agent loop built directly against the Anthropic Messages API — no agent framework — with end-to-end SSE streaming of agent reasoning and tool calls to a live UI. Deliberately tiered: deterministic keyword heuristics on the high-volume path, model calls reserved for curated work. React, TypeScript, Fastify, Prisma, PostgreSQL. Build complete and awaiting client testing and feedback.</w:t>
             </w:r>
           </w:p>
           <w:p>
@@ -1372,7 +1288,7 @@
                 <w:sz w:val="17"/>
                 <w:szCs w:val="17"/>
               </w:rPr>
-              <w:t xml:space="preserve">Advice Works Financial Market Dashboard</w:t>
+              <w:t xml:space="preserve">Automated Inspection Pipeline (Medical Client)</w:t>
             </w:r>
           </w:p>
           <w:p>
@@ -1386,7 +1302,36 @@
                 <w:sz w:val="17"/>
                 <w:szCs w:val="17"/>
               </w:rPr>
-              <w:t xml:space="preserve">Financial market dashboard for Adviceworx, with automated Telegram delivery of daily updates and Claude-powered market summarisation, built for Neozeit client work using a custom Telegram bot.</w:t>
+              <w:t>Synthetic-monitoring pipeline (Python, Playwright) running scripted transactions against a medical client’s production website and patient-booking platform on a systemd-timer schedule. Deterministic checks catch the common case at zero model cost. A failure triggers a cheap model (GLM-4.5-Air) for triage, and a full agent turn only runs when the failure needs a human-readable report, which then gets delivered automatically. Same tiered-delegation approach used across the rest of the agent work, applied here to uptime and performance monitoring instead of task orchestration.</w:t>
+            </w:r>
+          </w:p>
+          <w:p>
+            <w:pPr>
+              <w:spacing w:after="50" w:before="150"/>
+            </w:pPr>
+            <w:r>
+              <w:rPr>
+                <w:b/>
+                <w:bCs/>
+                <w:color w:val="1F3552"/>
+                <w:sz w:val="17"/>
+                <w:szCs w:val="17"/>
+              </w:rPr>
+              <w:t xml:space="preserve">MarketPulse Financial Market Dashboard</w:t>
+            </w:r>
+          </w:p>
+          <w:p>
+            <w:pPr>
+              <w:spacing w:after="90" w:line="250"/>
+              <w:jc w:val="left"/>
+            </w:pPr>
+            <w:r>
+              <w:rPr>
+                <w:color w:val="444444"/>
+                <w:sz w:val="17"/>
+                <w:szCs w:val="17"/>
+              </w:rPr>
+              <w:t xml:space="preserve">Financial market dashboard for a financial advisory practice, with automated Telegram delivery of daily updates, built for Neozeit client work using a custom Telegram bot.</w:t>
             </w:r>
           </w:p>
           <w:p>

</xml_diff>

<commit_message>
Fix Windows Server claim, anonymize Maropa, rewrite profile, fix titles
Splits the Windows Server 2025 migration out of the Proxmox bullet and
describes what actually happened (server build, networking, user setup,
company data migration, validation; an external vendor handled only
the Pastel install). Anonymizes the Maropa entry on the public CV to
match every other client. Rewrites the profile paragraph (drops the
"AI-assisted development" framing and the "seeking a role" close).
Corrects a misattributed job title: the sports-science agent is used by
a professional cyclist's own training business, not a "coach." Adds
TypeScript and MCP Server Development to Technical Skills.

Co-Authored-By: Claude Sonnet 5 <noreply@anthropic.com>
</commit_message>
<xml_diff>
--- a/assets/cv/David_Hill_CV.docx
+++ b/assets/cv/David_Hill_CV.docx
@@ -301,6 +301,21 @@
                 <w:sz w:val="16"/>
                 <w:szCs w:val="16"/>
               </w:rPr>
+              <w:t>MCP Server Development</w:t>
+            </w:r>
+          </w:p>
+          <w:p>
+            <w:pPr>
+              <w:spacing w:after="40"/>
+            </w:pPr>
+            <w:r>
+              <w:rPr>
+                <w:b w:val="false"/>
+                <w:bCs w:val="false"/>
+                <w:color w:val="444444"/>
+                <w:sz w:val="16"/>
+                <w:szCs w:val="16"/>
+              </w:rPr>
               <w:t>LLM Integration &amp; Prompt Engineering</w:t>
             </w:r>
           </w:p>
@@ -376,7 +391,7 @@
                 <w:sz w:val="16"/>
                 <w:szCs w:val="16"/>
               </w:rPr>
-              <w:t xml:space="preserve">Python, JavaScript &amp; PowerShell</w:t>
+              <w:t xml:space="preserve">Python, JavaScript, TypeScript &amp; PowerShell</w:t>
             </w:r>
           </w:p>
           <w:p>
@@ -558,7 +573,7 @@
                 <w:sz w:val="17"/>
                 <w:szCs w:val="17"/>
               </w:rPr>
-              <w:t>AI-focused developer with hands-on experience building multi-agent AI systems, LLM-based applications and retrieval-backed memory architectures. Designs system architecture and agent behaviour, then delivers through AI-assisted development — owning the design decisions, code review, debugging and production validation. Self-hosts a personal multi-agent AI stack in daily production use, and led the deployment of a production multi-agent system for a client workforce, including integration of MemPalace, a ChromaDB-based memory system for persistent context across agents. Coding with AI tools since 2022, from early manual prompt-loop workflows through to modern agentic development. Seeking a role where AI development, LLM engineering and automation intersect.</w:t>
+              <w:t>AI engineer with hands-on experience building multi-agent AI systems, LLM-based applications and retrieval-backed memory architectures. Designs system architecture and agent behaviour, and owns the design decisions, code review, debugging and production validation. Self-hosts a personal multi-agent AI stack in daily production use, and led the deployment of a production multi-agent system for a client workforce. Coding with AI tools since 2022, from early manual prompt loops through to modern agentic development.</w:t>
             </w:r>
           </w:p>
           <w:p>
@@ -759,7 +774,25 @@
                 <w:sz w:val="17"/>
                 <w:szCs w:val="17"/>
               </w:rPr>
-              <w:t xml:space="preserve">Sole operator of Neozeit's Proxmox VE infrastructure (3-node cluster, 12-drive RAID6 backup server, LTO-4 tape rotation, managed Avaya switch); led the Windows Server 2025 migration for a medical client.</w:t>
+              <w:t xml:space="preserve">Sole operator of Neozeit's Proxmox VE infrastructure (3-node cluster, 12-drive RAID6 backup server, LTO-4 tape rotation, managed Avaya switch).</w:t>
+            </w:r>
+          </w:p>
+          <w:p>
+            <w:pPr>
+              <w:pStyle w:val="ListParagraph"/>
+              <w:numPr>
+                <w:ilvl w:val="0"/>
+                <w:numId w:val="2"/>
+              </w:numPr>
+              <w:spacing w:after="60" w:line="250"/>
+            </w:pPr>
+            <w:r>
+              <w:rPr>
+                <w:color w:val="444444"/>
+                <w:sz w:val="17"/>
+                <w:szCs w:val="17"/>
+              </w:rPr>
+              <w:t xml:space="preserve">Built and configured a Windows Server 2025 VM on Neozeit's Proxmox infrastructure for a medical client, including networking and user/group setup, then migrated all of the client's company data sets onto it and validated end-to-end that users could log in and work; an external vendor handled the Pastel application install and licensing.</w:t>
             </w:r>
           </w:p>
           <w:p>
@@ -1157,7 +1190,7 @@
                 <w:sz w:val="17"/>
                 <w:szCs w:val="17"/>
               </w:rPr>
-              <w:t>Architected and self-host a production multi-agent system on OpenClaw for daily personal and family use: three isolated agents (a primary personal assistant, a sports-science coaching agent used live by a professional cycling coach, and a family-support agent) plus a local model runner (gemma4:12b via Ollama) for free on-device inference. The sports-science and family-support agents run on Kimi K3 with a GLM-5.2 fallback via OpenRouter. Each agent runs its own isolated MemPalace — an open-source ChromaDB-based memory system exposing 30 tool functions via its MCP server — for persistent, agent-scoped memory with zero cross-contamination. Self-hosted with no external dependencies for core execution.</w:t>
+              <w:t>Architected and self-host a production multi-agent system on OpenClaw for daily personal and family use: three isolated agents (a primary personal assistant, a sports-science agent used live by a professional cyclist's own training business, and a family-support agent) plus a local model runner (gemma4:12b via Ollama) for free on-device inference. The sports-science and family-support agents run on Kimi K3 with a GLM-5.2 fallback via OpenRouter. Each agent runs its own isolated MemPalace — an open-source ChromaDB-based memory system exposing 30 tool functions via its MCP server — for persistent, agent-scoped memory with zero cross-contamination. Self-hosted with no external dependencies for core execution.</w:t>
             </w:r>
           </w:p>
           <w:p>
@@ -1201,7 +1234,7 @@
                 <w:sz w:val="17"/>
                 <w:szCs w:val="17"/>
               </w:rPr>
-              <w:t xml:space="preserve">Maropa — AI Document-Intelligence Agent (Upcoming)</w:t>
+              <w:t xml:space="preserve">AI Document-Intelligence Agent (Upcoming)</w:t>
             </w:r>
           </w:p>
           <w:p>
@@ -1215,7 +1248,7 @@
                 <w:sz w:val="17"/>
                 <w:szCs w:val="17"/>
               </w:rPr>
-              <w:t xml:space="preserve">Confirmed upcoming engagement, not yet started: an agent that reads Excel spreadsheets, invoices and PDFs and pre-populates Xero accounting entries, reducing manual data capture in bookkeeping workflows.</w:t>
+              <w:t xml:space="preserve">Confirmed upcoming engagement for a client, not yet started: an agent that reads Excel spreadsheets, invoices and PDFs and pre-populates Xero accounting entries, reducing manual data capture in bookkeeping workflows.</w:t>
             </w:r>
           </w:p>
           <w:p>

</xml_diff>

<commit_message>
Rewrite CV for approved portfolio scope
</commit_message>
<xml_diff>
--- a/assets/cv/David_Hill_CV.docx
+++ b/assets/cv/David_Hill_CV.docx
@@ -128,7 +128,7 @@
                 <w:sz w:val="16"/>
                 <w:szCs w:val="16"/>
               </w:rPr>
-              <w:t>Portfolio: portfolio.necroknollnexus.dpdns.org</w:t>
+              <w:t>Portfolio: sassblanket98.github.io</w:t>
             </w:r>
           </w:p>
           <w:p>
@@ -331,36 +331,6 @@
                 <w:sz w:val="16"/>
                 <w:szCs w:val="16"/>
               </w:rPr>
-              <w:t>RAG &amp; Vector Databases</w:t>
-            </w:r>
-          </w:p>
-          <w:p>
-            <w:pPr>
-              <w:spacing w:after="40"/>
-            </w:pPr>
-            <w:r>
-              <w:rPr>
-                <w:b w:val="false"/>
-                <w:bCs w:val="false"/>
-                <w:color w:val="444444"/>
-                <w:sz w:val="16"/>
-                <w:szCs w:val="16"/>
-              </w:rPr>
-              <w:t>ChromaDB / Vector Memory Systems</w:t>
-            </w:r>
-          </w:p>
-          <w:p>
-            <w:pPr>
-              <w:spacing w:after="40"/>
-            </w:pPr>
-            <w:r>
-              <w:rPr>
-                <w:b w:val="false"/>
-                <w:bCs w:val="false"/>
-                <w:color w:val="444444"/>
-                <w:sz w:val="16"/>
-                <w:szCs w:val="16"/>
-              </w:rPr>
               <w:t>AI Application Development</w:t>
             </w:r>
           </w:p>
@@ -376,7 +346,7 @@
                 <w:sz w:val="16"/>
                 <w:szCs w:val="16"/>
               </w:rPr>
-              <w:t>Anthropic API / Claude</w:t>
+              <w:t>Anthropic API / Claude, OpenAI Codex</w:t>
             </w:r>
           </w:p>
           <w:p>
@@ -573,7 +543,7 @@
                 <w:sz w:val="17"/>
                 <w:szCs w:val="17"/>
               </w:rPr>
-              <w:t>AI engineer with hands-on experience building multi-agent AI systems, LLM-based applications and retrieval-backed memory architectures. Designs system architecture and agent behaviour, and owns the design decisions, code review, debugging and production validation. Self-hosts a personal multi-agent AI stack in daily production use, and led the deployment of a production multi-agent system for a client workforce. Coding with AI tools since 2022, from early manual prompt loops through to modern agentic development.</w:t>
+              <w:t>AI engineer with hands-on experience building multi-agent AI systems and LLM-based applications. Designs system architecture and agent behaviour, then stays hands-on through code review, debugging and production testing rather than handing that off. Self-hosts a personal multi-agent AI stack for daily use, and led the deployment of a production multi-agent system for a client workforce. Writing code with AI tools since 2022, from early manual prompt loops through to agentic development today.</w:t>
             </w:r>
           </w:p>
           <w:p>
@@ -648,7 +618,7 @@
                 <w:sz w:val="17"/>
                 <w:szCs w:val="17"/>
               </w:rPr>
-              <w:t>Led the design and deployment of a multi-agent AI automation system (OpenClaw) for a two-company client workforce, including integration of MemPalace, a ChromaDB-based memory system for persistent agent context.</w:t>
+              <w:t>Led the design and deployment of a multi-agent AI automation system (OpenClaw) for a two-company client workforce, integrating MemPalace (open source) for persistent agent memory.</w:t>
             </w:r>
           </w:p>
           <w:p>
@@ -684,61 +654,43 @@
                 <w:sz w:val="17"/>
                 <w:szCs w:val="17"/>
               </w:rPr>
-              <w:t>Built a custom ClickUp MCP server (TypeScript, 18 tools) via Anthropic’s MCP builder skill, because the official ClickUp MCP server has no OpenClaw support; integrated into the flagship production agent.</w:t>
-            </w:r>
-          </w:p>
-          <w:p>
-            <w:pPr>
-              <w:pStyle w:val="ListParagraph"/>
-              <w:numPr>
-                <w:ilvl w:val="0"/>
-                <w:numId w:val="2"/>
-              </w:numPr>
-              <w:spacing w:after="60" w:line="250"/>
-            </w:pPr>
-            <w:r>
-              <w:rPr>
-                <w:color w:val="444444"/>
-                <w:sz w:val="17"/>
-                <w:szCs w:val="17"/>
-              </w:rPr>
-              <w:t xml:space="preserve">Built and deployed production web applications for clients, including a doctor location mapping tool (Node.js).</w:t>
-            </w:r>
-          </w:p>
-          <w:p>
-            <w:pPr>
-              <w:pStyle w:val="ListParagraph"/>
-              <w:numPr>
-                <w:ilvl w:val="0"/>
-                <w:numId w:val="2"/>
-              </w:numPr>
-              <w:spacing w:after="60" w:line="250"/>
-            </w:pPr>
-            <w:r>
-              <w:rPr>
-                <w:color w:val="444444"/>
-                <w:sz w:val="17"/>
-                <w:szCs w:val="17"/>
-              </w:rPr>
-              <w:t>Developed and maintain a financial market dashboard for a financial advisory practice with automated Telegram delivery of daily updates, built for Neozeit client work using a custom Telegram bot.</w:t>
-            </w:r>
-          </w:p>
-          <w:p>
-            <w:pPr>
-              <w:pStyle w:val="ListParagraph"/>
-              <w:numPr>
-                <w:ilvl w:val="0"/>
-                <w:numId w:val="2"/>
-              </w:numPr>
-              <w:spacing w:after="60" w:line="250"/>
-            </w:pPr>
-            <w:r>
-              <w:rPr>
-                <w:color w:val="444444"/>
-                <w:sz w:val="17"/>
-                <w:szCs w:val="17"/>
-              </w:rPr>
-              <w:t>Built a Microsoft 365 recon and visibility dashboard using Extractor Suite and Analyzer Suite outputs for SharePoint environments and tenant-wide security statistics.</w:t>
+              <w:t>Built a custom ClickUp MCP server (TypeScript) using Anthropic’s MCP builder skill, since the official ClickUp MCP server doesn’t support OpenClaw; integrated it into the client’s production agent.</w:t>
+            </w:r>
+          </w:p>
+          <w:p>
+            <w:pPr>
+              <w:pStyle w:val="ListParagraph"/>
+              <w:numPr>
+                <w:ilvl w:val="0"/>
+                <w:numId w:val="2"/>
+              </w:numPr>
+              <w:spacing w:after="60" w:line="250"/>
+            </w:pPr>
+            <w:r>
+              <w:rPr>
+                <w:color w:val="444444"/>
+                <w:sz w:val="17"/>
+                <w:szCs w:val="17"/>
+              </w:rPr>
+              <w:t>Built and deployed production web applications for clients, including a financial market dashboard with automated Telegram delivery (see MarketPulse below).</w:t>
+            </w:r>
+          </w:p>
+          <w:p>
+            <w:pPr>
+              <w:pStyle w:val="ListParagraph"/>
+              <w:numPr>
+                <w:ilvl w:val="0"/>
+                <w:numId w:val="2"/>
+              </w:numPr>
+              <w:spacing w:after="60" w:line="250"/>
+            </w:pPr>
+            <w:r>
+              <w:rPr>
+                <w:color w:val="444444"/>
+                <w:sz w:val="17"/>
+                <w:szCs w:val="17"/>
+              </w:rPr>
+              <w:t>Developed and maintain a financial market dashboard for a financial advisory practice, with automated Telegram delivery of daily updates using a custom Telegram bot.</w:t>
             </w:r>
           </w:p>
           <w:p>
@@ -1176,7 +1128,7 @@
                 <w:sz w:val="17"/>
                 <w:szCs w:val="17"/>
               </w:rPr>
-              <w:t xml:space="preserve">Personal Multi-Agent AI Stack</w:t>
+              <w:t>Multi-Tenant AI Gateway — Authorised Client Deployment</w:t>
             </w:r>
           </w:p>
           <w:p>
@@ -1190,7 +1142,7 @@
                 <w:sz w:val="17"/>
                 <w:szCs w:val="17"/>
               </w:rPr>
-              <w:t>Architected and self-host a production multi-agent system on OpenClaw for daily personal and family use: three isolated agents (a primary personal assistant, a sports-science agent used live by a professional cyclist's own training business, and a family-support agent), all on Kimi K3 with a GLM-5.2 fallback via OpenRouter. Scheduled background jobs follow the same tiered-delegation principle as the client deployment: lightweight recurring tasks run locally on gemma4:12b, jobs needing real judgement escalate to GLM-5.2. Each agent runs its own isolated MemPalace — an open-source ChromaDB-based memory system exposing 30 tool functions via its MCP server — for persistent, agent-scoped memory with zero cross-contamination. Self-hosted with no external dependencies for core execution.</w:t>
+              <w:t>Multi-agent deployment on OpenClaw for two independent client companies sharing one gateway: an Orchestrator, a live production PM/admin-support agent (Jeeves), and two department agents built and tool-scoped, currently paused for rollout. Each agent's tools and memory access are scoped to its role and tenant; that scoping is reviewed and tightened on an ongoing basis rather than treated as solved. Department agents report to the client teams that own the work, not back through the operator. Ongoing development and maintenance.</w:t>
             </w:r>
           </w:p>
           <w:p>
@@ -1205,7 +1157,7 @@
                 <w:sz w:val="17"/>
                 <w:szCs w:val="17"/>
               </w:rPr>
-              <w:t xml:space="preserve">Multi-Tenant Agent Deployment</w:t>
+              <w:t>Personal AI Stack — Self-Hosted Personal Project</w:t>
             </w:r>
           </w:p>
           <w:p>
@@ -1219,7 +1171,7 @@
                 <w:sz w:val="17"/>
                 <w:szCs w:val="17"/>
               </w:rPr>
-              <w:t>Designed and deployed a production multi-agent system on OpenClaw for a client workforce across two tenant companies: an orchestrator, a live production executive-assistant agent, and two department agents (marketing and social media) designed and scoped for rollout. Integrated MemPalace, a ChromaDB-based memory system with physically separate palace instances and wing-scoped isolation per tenant. Tenant and department boundaries are enforced by filesystem and tool-schema configuration, not just documented policy, backed by a gated knowledge-graph write protocol and automated diary, compression and promotion pipelines. Migrated the agent fleet off the Anthropic API to Kimi K3 in July 2026, cutting inference costs while enhancing reliability, keeping the architecture provider-agnostic by design. Ongoing development and maintenance.</w:t>
+              <w:t>Self-hosted multi-agent setup for personal research, planning and day-to-day automation, built on OpenClaw and running on OpenAI Codex. MemPalace (open source) handles agent memory; integrated it and added custom diary and checkpoint workflows on top. Each agent has its own scoped memory and toolset, actively maintained rather than assumed to be closed.</w:t>
             </w:r>
           </w:p>
           <w:p>
@@ -1234,7 +1186,7 @@
                 <w:sz w:val="17"/>
                 <w:szCs w:val="17"/>
               </w:rPr>
-              <w:t xml:space="preserve">AI Document-Intelligence Agent (Upcoming)</w:t>
+              <w:t>NHC Inspection &amp; Monitoring Pipeline — Authorised Client Work</w:t>
             </w:r>
           </w:p>
           <w:p>
@@ -1248,7 +1200,7 @@
                 <w:sz w:val="17"/>
                 <w:szCs w:val="17"/>
               </w:rPr>
-              <w:t xml:space="preserve">Confirmed upcoming engagement for a client, not yet started: an agent that reads Excel spreadsheets, invoices and PDFs and pre-populates Xero accounting entries, reducing manual data capture in bookkeeping workflows.</w:t>
+              <w:t>Built and operate an automated inspection pipeline for NHC's public website and patient portal. Runs scheduled checks against key public pages and a full appointment-booking flow, verifies cleanup afterward, captures diagnostic evidence, and delivers structured status reports twice daily, with failures classified by affected stage, likely owner, and recommended next action.</w:t>
             </w:r>
           </w:p>
           <w:p>
@@ -1263,7 +1215,7 @@
                 <w:sz w:val="17"/>
                 <w:szCs w:val="17"/>
               </w:rPr>
-              <w:t xml:space="preserve">Vantage Point Dashboard — AI Cyber Intelligence &amp; GTM Platform (Cybersecurity Vendor)</w:t>
+              <w:t>MarketPulse — Anonymised Beta/Client Demo</w:t>
             </w:r>
           </w:p>
           <w:p>
@@ -1277,7 +1229,7 @@
                 <w:sz w:val="17"/>
                 <w:szCs w:val="17"/>
               </w:rPr>
-              <w:t xml:space="preserve">Full-stack platform combining RSS threat-intel aggregation, autonomous competitor research and persona-tailored content generation. Custom ReAct-style agent loop built directly against the Anthropic Messages API — no agent framework — with end-to-end SSE streaming of agent reasoning and tool calls to a live UI. Deliberately tiered: deterministic keyword heuristics on the high-volume path, model calls reserved for curated work. React, TypeScript, Fastify, Prisma, PostgreSQL. Build complete and awaiting client testing and feedback.</w:t>
+              <w:t>Daily market-briefing dashboard for a financial advisory practice: pulls index, forex and commodity data plus regional news, then sends a formatted briefing to Telegram from one button. Rebuilt from a single-file prototype into a full React and Express stack without changing how the advisors use it day to day.</w:t>
             </w:r>
           </w:p>
           <w:p>
@@ -1292,7 +1244,7 @@
                 <w:sz w:val="17"/>
                 <w:szCs w:val="17"/>
               </w:rPr>
-              <w:t xml:space="preserve">Doctor Location Mapping Tool (Node.js)</w:t>
+              <w:t>Vantage Point — Anonymised Beta/Client Demo</w:t>
             </w:r>
           </w:p>
           <w:p>
@@ -1306,7 +1258,7 @@
                 <w:sz w:val="17"/>
                 <w:szCs w:val="17"/>
               </w:rPr>
-              <w:t>Production mapping platform for a medical client. Directors and marketing teams use it to visualise which doctors work with the organisation and where they are located. Node.js, Express, Sequelize, MariaDB, Leaflet, with React web, React Native Android and a PWA build. Ships a read-only MCP server exposing codebase query tools.</w:t>
+              <w:t>Competitive-intelligence dashboard for a cybersecurity vendor: an AI-curated news feed, a competitor tracker, a content generator and a lightweight outreach CRM behind one login. Styled like a cyber-terminal on purpose, since the client's own product is a security tool. React, TypeScript, Fastify, Prisma, PostgreSQL, Anthropic Messages API. Live as an anonymised public demo.</w:t>
             </w:r>
           </w:p>
           <w:p>
@@ -1321,7 +1273,7 @@
                 <w:sz w:val="17"/>
                 <w:szCs w:val="17"/>
               </w:rPr>
-              <w:t xml:space="preserve">Automated Inspection Pipeline (Medical Client)</w:t>
+              <w:t>HillSkills.co.za — Public Production Site</w:t>
             </w:r>
           </w:p>
           <w:p>
@@ -1335,36 +1287,7 @@
                 <w:sz w:val="17"/>
                 <w:szCs w:val="17"/>
               </w:rPr>
-              <w:t>Synthetic-monitoring pipeline (Python, Playwright) running scripted transactions against a medical client’s production website and patient-booking platform on a systemd-timer schedule. Deterministic checks catch the common case at zero model cost. A failure triggers a cheap model (GLM-4.5-Air) for triage, and a full agent turn only runs when the failure needs a human-readable report, which then gets delivered automatically. Same tiered-delegation approach used across the rest of the agent work, applied here to uptime and performance monitoring instead of task orchestration.</w:t>
-            </w:r>
-          </w:p>
-          <w:p>
-            <w:pPr>
-              <w:spacing w:after="50" w:before="150"/>
-            </w:pPr>
-            <w:r>
-              <w:rPr>
-                <w:b/>
-                <w:bCs/>
-                <w:color w:val="1F3552"/>
-                <w:sz w:val="17"/>
-                <w:szCs w:val="17"/>
-              </w:rPr>
-              <w:t xml:space="preserve">MarketPulse Financial Market Dashboard</w:t>
-            </w:r>
-          </w:p>
-          <w:p>
-            <w:pPr>
-              <w:spacing w:after="90" w:line="250"/>
-              <w:jc w:val="left"/>
-            </w:pPr>
-            <w:r>
-              <w:rPr>
-                <w:color w:val="444444"/>
-                <w:sz w:val="17"/>
-                <w:szCs w:val="17"/>
-              </w:rPr>
-              <w:t xml:space="preserve">Financial market dashboard for a financial advisory practice, with automated Telegram delivery of daily updates, built for Neozeit client work using a custom Telegram bot.</w:t>
+              <w:t>Named, live site built end to end for a PMBIA-certified mountain bike coaching business, still hosted and managed personally. Static HTML/CSS/JS front end with a PHP contact form that sends mail over the Microsoft Graph API, since shared hosting blocks outbound SMTP.</w:t>
             </w:r>
           </w:p>
           <w:p>
@@ -1401,7 +1324,7 @@
                 <w:sz w:val="17"/>
                 <w:szCs w:val="17"/>
               </w:rPr>
-              <w:t xml:space="preserve">Began coding with AI assistance in 2022, using early-generation LLMs in a manual prompt-and-paste workflow before agentic coding tools existed. Now works fluently across modern AI development tooling including Claude Code and Cursor.</w:t>
+              <w:t>Began coding with AI assistance in 2022, using early-generation LLMs in a manual prompt-and-paste workflow before agentic coding tools existed. Now works regularly with modern AI development tooling including Claude Code and Cursor.</w:t>
             </w:r>
           </w:p>
           <w:p>

</xml_diff>